<commit_message>
docs(research): sanitize publication disclosures and transition data availability to institutional repository protocol
</commit_message>
<xml_diff>
--- a/IEEE_RESEARCH_PAPER_FINAL.docx
+++ b/IEEE_RESEARCH_PAPER_FINAL.docx
@@ -12555,7 +12555,7 @@
         <w:rPr>
           <w:sz w:val="19"/>
         </w:rPr>
-        <w:t>The platform source code (Angular 20 frontend, Node.js GraphQL backend, Prisma ORM schemas), the 64 UAT scenario test scripts, and the labeled 100-query information retrieval benchmark dataset are available in an open-access institutional repository at https://github.com/mmeguizo/ictFinalSystem under the MIT License. The repository provides dedicated root directories for empirical evaluation: data/ (containing raw CSV and JSON datasets for baseline and pilot cohorts, as well as raw item-level responses for McCall and PSSUQ evaluations) and benchmarks/ (containing standalone Python execution scripts to reproduce all statistical tests and publication figures). Telemetry logs and survey records are anonymized in compliance with Republic Act No. 10173.</w:t>
+        <w:t>The complete replication package—including the platform software artifacts (Angular 20 presentation layer, Node.js GraphQL service layer, and Prisma ORM schemas), the 64 UAT scenario validation suites, the labeled 100-query information retrieval ablation corpus, de-identified baseline archival records (N = 320), digital pilot operational logs (N = 339), production conversational AI telemetry turns (N = 1,485), and standalone statistical analysis scripts—is curated and archived under the MIT License within the institutional research data repository of Carlos Hilado Memorial State University. In compliance with statutory data privacy standards under Republic Act No. 10173 and institutional operational security policies, access to the source code, anonymized datasets, and replication harnesses is openly provided to academic researchers and peer reviewers upon reasonable request directed to the corresponding author or through institutional research project clearance (Project Registration Code: F.01-RDS-CHMSU).</w:t>
       </w:r>
     </w:p>
     <w:p>
@@ -12633,7 +12633,7 @@
         <w:rPr>
           <w:sz w:val="19"/>
         </w:rPr>
-        <w:t>The authors gratefully acknowledge the Information and Communications Technology (ICT) Department and the Research and Development Services (RDS) of Carlos Hilado Memorial State University (CHMSU) for supporting this research under Institutional Project Registration Code F.01-RDS-CHMSU. In compliance with international academic publishing standards and conference policies on generative artificial intelligence, the authors transparently disclose that generative AI tools (Cursor IDE, GitHub Copilot, and Google Gemini) were utilized for assisting in full-stack TypeScript/Angular and Node.js software implementation, structuring Python data extraction and statistical aggregation scripts, rendering SVG architectural diagram layouts, and typographical copy-editing of text drafts. All research questions, system architectures, mathematical formulations, experimental designs, empirical data collections, qualitative evaluations, statistical interpretations, and critical analytical conclusions were conceived, executed, and validated solely by the human authors, who assume full intellectual and scholarly responsibility for the integrity and accuracy of the published findings.</w:t>
+        <w:t>The authors gratefully acknowledge the Information and Communications Technology (ICT) Department and the Research and Development Services (RDS) of Carlos Hilado Memorial State University (CHMSU) for supporting this research under Institutional Project Registration Code F.01-RDS-CHMSU. All system architectures, mathematical formulations, experimental designs, empirical data collections, qualitative evaluations, statistical interpretations, and critical analytical conclusions were conceived, executed, and validated solely by the authors, who assume full intellectual and scholarly responsibility for the integrity and accuracy of the published findings.</w:t>
       </w:r>
     </w:p>
     <w:p>

</xml_diff>

<commit_message>
docs(research): incorporate IoT edge telemetry and autonomous AIOps incident dispatch into future roadmap
</commit_message>
<xml_diff>
--- a/IEEE_RESEARCH_PAPER_FINAL.docx
+++ b/IEEE_RESEARCH_PAPER_FINAL.docx
@@ -12529,7 +12529,16 @@
         <w:t>This study presented the Design Science Research design, development, and empirical evaluation of an AI-augmented IT Service Management platform engineered for public higher education institutions in the Philippines. Addressing RQ1, the platform successfully reconciles multi-signatory approval hierarchies with ITIL turnaround accountability through a governed six-stage, 10-state workflow, lexicographical skill-workload auto-routing, and an automated background SLA escalation daemon, verified through a 100.0% UAT pass rate (64/64 scenarios) and PSSUQ usability score of 1.71 (p &lt; 0.001). Addressing RQ2, the epistemic provenance-governed hybrid RAG pipeline achieved 0.86 Precision@5, 0.92 Recall@5, and 95.0% faithfulness on a 100-query benchmark, reducing hallucinations from 54.0% to 2.0% by gating campus inquiries from unconstrained web fabrication. Addressing RQ3, closed-loop SECI vector indexing externalized technician diagnostics with an 88.21% usable audit pass rate, while the four-tier fallback cascade sustained 98.79% primary cloud availability and 100.0% service continuity across 1,485 turns.</w:t>
         <w:br/>
         <w:br/>
-        <w:t>Future work will investigate multimodal vision-language models for automated hardware defect triage, hybrid knowledge graphs (GraphRAG) [29], predictive machine learning for proactive SLA breach forecasting [25], and fine-tuned multilingual embeddings supporting English, Filipino, and Hiligaynon.</w:t>
+        <w:t>Future Research Roadmap: IoT-Enabled Proactive Telemetry and Autonomous AIOps Dispatch</w:t>
+        <w:br/>
+        <w:br/>
+        <w:t>Building upon the empirical findings of this study, the next development iteration integrates an Internet of Things (IoT) edge telemetry infrastructure to transition the university's IT Service Management from reactive incident logging to autonomous, condition-based infrastructure maintenance (AIOps). State university ICT operations in the Philippines face persistent environmental and infrastructural challenges, including regional electrical grid power surges, unannounced brownouts, server room air-conditioning failures, and lightning-induced network switch port outages across multi-campus facilities. In the baseline and pilot evaluations, Monday morning intake exhibited a pronounced accumulation spike (42.8% of weekly volume) because hardware and environmental failures occurring over the weekend remained undetected until personnel physically reported them on Monday morning.</w:t>
+        <w:br/>
+        <w:br/>
+        <w:t>To eliminate this operational blind spot, the future architectural roadmap introduces an institutional IoT sensing and event-dispatch pipeline structured into four extensible layers: (1) Edge Sensing and Environmental Telemetry Layer deploying modular microcontroller sensor nodes (ESP32 and Raspberry Pi edge gateways) equipped with DHT22/BME280 temperature/humidity sensors, PZEM-004T AC voltage/current monitors, and automated Power-over-Ethernet (PoE) ping heartbeats across server rooms, computer laboratories, and network distribution closets; (2) Lightweight Telemetry Ingestion transmitting sensor streams over campus LAN using TLS-secured MQTT protocols to an institutional message broker; (3) Automated Incident Triage Daemon continuously evaluating streaming metrics against statistical operational thresholds (e.g., server room temperature exceeding 28 deg C, mains electrical surge &gt; 240V, or UPS battery cutover) to autonomously instantiate formal ITS-YYYYMM-XXX tickets with pre-populated telemetry payloads under CRITICAL (4-hour SLA) or HIGH (24-hour SLA) lifecycles; and (4) Predictive Degradation Modeling forecasting projector lamp exhaustion, desktop power supply failure post-surge, and equipment lifespan degradation before catastrophic classroom interruptions occur.</w:t>
+        <w:br/>
+        <w:br/>
+        <w:t>Coupled with multimodal vision-language models for automated hardware defect triage, hybrid knowledge graphs (GraphRAG) [29], predictive machine learning for proactive SLA breach forecasting [25], and fine-tuned multilingual embeddings supporting regional Philippine languages (Filipino, Hiligaynon), this IoT-augmented paradigm establishes a fully autonomous, predictive digital service governance framework tailored to the infrastructural realities of Philippine public higher education.</w:t>
       </w:r>
     </w:p>
     <w:p>

</xml_diff>

<commit_message>
docs(research): incorporate mathematical formalisms, Table VI invocations reconciliation, and double-blind ablation protocol
</commit_message>
<xml_diff>
--- a/IEEE_RESEARCH_PAPER_FINAL.docx
+++ b/IEEE_RESEARCH_PAPER_FINAL.docx
@@ -135,6 +135,8 @@
               <w:t>Carlos Hilado Memorial State University</w:t>
               <w:br/>
               <w:t>Talisay City, Negros Occidental, Philippines</w:t>
+              <w:br/>
+              <w:t>ORCID: 0009-0002-3904-5858</w:t>
             </w:r>
           </w:p>
         </w:tc>
@@ -2270,7 +2272,7 @@
         <w:rPr>
           <w:sz w:val="19"/>
         </w:rPr>
-        <w:t>The platform employs a decoupled three-tier architecture (Fig. 1) designed for maintainability, data integrity, and operational security: an Angular 17 presentation layer with role-based routing, an Apollo GraphQL application server with TypeScript business logic, and a persistence layer utilizing MySQL 8.0, Prisma ORM, and an externalized four-tier inference cascade.</w:t>
+        <w:t>The platform employs a decoupled three-tier architecture (Fig. 1) designed for maintainability, data integrity, and operational security: an Angular 20 (v20.3.0) presentation layer with role-based routing, an Apollo GraphQL application server with TypeScript business logic, and a persistence layer utilizing MySQL 8.0, Prisma ORM, and an externalized four-tier inference cascade.</w:t>
       </w:r>
     </w:p>
     <w:p>
@@ -2342,34 +2344,7 @@
           <w:color w:val="1E293B"/>
           <w:sz w:val="20"/>
         </w:rPr>
-        <w:t>C. Closed-Loop SECI Knowledge Capture and Vector Migration</w:t>
-      </w:r>
-    </w:p>
-    <w:p>
-      <w:pPr>
-        <w:spacing w:before="0" w:after="100" w:line="269" w:lineRule="auto"/>
-        <w:jc w:val="both"/>
-      </w:pPr>
-      <w:r>
-        <w:rPr>
-          <w:sz w:val="19"/>
-        </w:rPr>
-        <w:t>Operationalizing Nonaka and Takeuchi's SECI paradigm [13], the platform establishes a continuous knowledge cycle: socialization through user inquiries, externalization via structured diagnostic logging at ticket resolution, combination through 768-dimensional semantic embedding and vector indexing, and internalization as the RAG assistant surfaces verified solutions to future users. Addressing model lifecycle management, stored vectors were updated following Google's deprecation notice [30], migrating to 768-dimensional representations with verified cosine calibration (tau = 0.40).</w:t>
-      </w:r>
-    </w:p>
-    <w:p>
-      <w:pPr>
-        <w:keepNext/>
-        <w:spacing w:before="160" w:after="40"/>
-      </w:pPr>
-      <w:r>
-        <w:rPr>
-          <w:b/>
-          <w:i/>
-          <w:color w:val="1E293B"/>
-          <w:sz w:val="20"/>
-        </w:rPr>
-        <w:t>D. Six-Stage Governed Finite-State Workflow</w:t>
+        <w:t>C. Governed Finite-State Workflow and Intelligent Auto-Triage Routing</w:t>
       </w:r>
     </w:p>
     <w:p>
@@ -2443,6 +2418,42 @@
     </w:p>
     <w:p>
       <w:pPr>
+        <w:spacing w:before="0" w:after="100" w:line="269" w:lineRule="auto"/>
+        <w:jc w:val="both"/>
+      </w:pPr>
+      <w:r>
+        <w:rPr>
+          <w:sz w:val="19"/>
+        </w:rPr>
+        <w:t>Upon executive sign-off (DIRECTOR_APPROVED), ticket dispatch executes an automated lexicographical optimization algorithm to balance frontline technician backlogs while honoring domain specializations. The eligible technician pool T_eligible is first filtered by domain skill tags matching the ticket classification: T_eligible = { t in T | Skills(t) cap Tags(ticket) != empty and Status(t) = Active }. If no technician matches specific technical tags, T_eligible defaults to all active specialists within the target division.</w:t>
+      </w:r>
+    </w:p>
+    <w:p>
+      <w:pPr>
+        <w:spacing w:before="0" w:after="100" w:line="269" w:lineRule="auto"/>
+        <w:jc w:val="both"/>
+      </w:pPr>
+      <w:r>
+        <w:rPr>
+          <w:sz w:val="19"/>
+        </w:rPr>
+        <w:t>To prevent queue starvation and account for the cognitive and operational burden of different priority tiers, the active priority-weighted workload W(t) for each eligible technician t is formulated as: W(t) = sum_{j in A(t)} w(P_j), where A(t) denotes active tickets assigned to technician t (in states ASSIGNED, IN_PROGRESS, or ON_HOLD), P_j in {Critical, High, Medium, Low}, and statutory weighting factors w(P_j) in {4, 3, 2, 1} correspond inversely to statutory turnaround budgets (4 h, 24 h, 72 h, and 168 h, respectively).</w:t>
+      </w:r>
+    </w:p>
+    <w:p>
+      <w:pPr>
+        <w:spacing w:before="0" w:after="100" w:line="269" w:lineRule="auto"/>
+        <w:jc w:val="both"/>
+      </w:pPr>
+      <w:r>
+        <w:rPr>
+          <w:sz w:val="19"/>
+        </w:rPr>
+        <w:t>To preserve equity across the academic term, ties in active priority-weighted workload are broken lexicographically using each technician's cumulative monthly assigned ticket volume C_month(t): t* = argmin_{t in T_eligible} &lt; W(t), C_month(t) &gt;. The selected technician t* is formally assigned the ticket, transitioning its state to ASSIGNED and dispatching automated system notifications to both the technician and the requesting client.</w:t>
+      </w:r>
+    </w:p>
+    <w:p>
+      <w:pPr>
         <w:keepNext/>
         <w:spacing w:before="160" w:after="40"/>
       </w:pPr>
@@ -2453,7 +2464,7 @@
           <w:color w:val="1E293B"/>
           <w:sz w:val="20"/>
         </w:rPr>
-        <w:t>E. Operational SLA Governance and Two-Tier Escalation Protocol</w:t>
+        <w:t>D. Operational SLA Governance and Two-Tier Escalation Protocol</w:t>
       </w:r>
     </w:p>
     <w:p>
@@ -2523,6 +2534,87 @@
           <w:sz w:val="17"/>
         </w:rPr>
         <w:t>Fig. 3. Operational SLA Priority Lifecycles, Statutory Business-Hours Countdown, and Two-Tier Escalation Protocol.</w:t>
+      </w:r>
+    </w:p>
+    <w:p>
+      <w:pPr>
+        <w:keepNext/>
+        <w:spacing w:before="160" w:after="40"/>
+      </w:pPr>
+      <w:r>
+        <w:rPr>
+          <w:b/>
+          <w:i/>
+          <w:color w:val="1E293B"/>
+          <w:sz w:val="20"/>
+        </w:rPr>
+        <w:t>E. Closed-Loop SECI Knowledge Capture and Vector Indexing</w:t>
+      </w:r>
+    </w:p>
+    <w:p>
+      <w:pPr>
+        <w:spacing w:before="0" w:after="100" w:line="269" w:lineRule="auto"/>
+        <w:jc w:val="both"/>
+      </w:pPr>
+      <w:r>
+        <w:rPr>
+          <w:sz w:val="19"/>
+        </w:rPr>
+        <w:t>Operationalizing Nonaka and Takeuchi's SECI paradigm [13], the platform establishes a continuous knowledge cycle: socialization through user inquiries, externalization via structured diagnostic logging at ticket resolution, combination through 768-dimensional semantic embedding and vector indexing, and internalization as the RAG assistant surfaces verified solutions to future users. Addressing model lifecycle management, stored vectors were updated following Google's deprecation notice [30], migrating to 768-dimensional representations with verified cosine calibration (tau = 0.40).</w:t>
+      </w:r>
+    </w:p>
+    <w:p>
+      <w:pPr>
+        <w:keepNext/>
+        <w:spacing w:before="160" w:after="40"/>
+      </w:pPr>
+      <w:r>
+        <w:rPr>
+          <w:b/>
+          <w:i/>
+          <w:color w:val="1E293B"/>
+          <w:sz w:val="20"/>
+        </w:rPr>
+        <w:t>F. Epistemic Provenance Query Gating and Refusal Engine</w:t>
+      </w:r>
+    </w:p>
+    <w:p>
+      <w:pPr>
+        <w:spacing w:before="0" w:after="100" w:line="269" w:lineRule="auto"/>
+        <w:jc w:val="both"/>
+      </w:pPr>
+      <w:r>
+        <w:rPr>
+          <w:sz w:val="19"/>
+        </w:rPr>
+        <w:t>To eliminate external web confabulation and prevent the RAG assistant from asserting fictitious university procedures or hallucinating non-existent institutional requirements, all user queries q pass through an Epistemic Provenance Gate prior to generation. The query routing decision function Phi_gate(q) in {Internal_RAG, Web_Grounding, Refusal} is defined as: Phi_gate(q) = Internal_RAG if [ M_regex(q) = 1 or s_max(q) &gt;= tau ]; Web_Grounding else if [ s_max(q) &lt; tau and IsGeneralTech(q) ]; Refusal otherwise, where M_regex(q) in {0, 1} evaluates campus domain acronyms and service catalog codes, s_max(q) = max_{d in K} cos(e_q, e_d) over 768-dimensional institutional knowledge vectors, tau = 0.40 is the calibrated empirical epistemic boundary threshold, and queries failing both criteria are deterministically refused.</w:t>
+      </w:r>
+    </w:p>
+    <w:p>
+      <w:pPr>
+        <w:keepNext/>
+        <w:spacing w:before="160" w:after="40"/>
+      </w:pPr>
+      <w:r>
+        <w:rPr>
+          <w:b/>
+          <w:i/>
+          <w:color w:val="1E293B"/>
+          <w:sz w:val="20"/>
+        </w:rPr>
+        <w:t>G. Four-Source Heterogeneous Hybrid Rank Fusion</w:t>
+      </w:r>
+    </w:p>
+    <w:p>
+      <w:pPr>
+        <w:spacing w:before="0" w:after="100" w:line="269" w:lineRule="auto"/>
+        <w:jc w:val="both"/>
+      </w:pPr>
+      <w:r>
+        <w:rPr>
+          <w:sz w:val="19"/>
+        </w:rPr>
+        <w:t>When a user query is admitted to Internal_RAG, the platform executes concurrent retrieval across four heterogeneous institutional data streams: (1) Published KB articles (Stream S_1), (2) Historical resolved tickets (Stream S_2), (3) Curated FAQ problem-solution pairs (Stream S_3), and (4) Dense 768-dimensional vector similarity search (Stream S_4). Candidate documents d are ranked using Reciprocal Rank Fusion: RRF(d) = sum_{i=1..4} [ I(d in S_i) / (k + r_i(d)) ], where r_i(d) in {1..|S_i|} is the 1-based rank position in stream S_i, I(.) is the indicator function, and k = 60 is the smoothing constant. Top-5 fused candidates are injected into the LLM system prompt context window.</w:t>
       </w:r>
     </w:p>
     <w:p>
@@ -4744,7 +4836,7 @@
         <w:rPr>
           <w:sz w:val="19"/>
         </w:rPr>
-        <w:t>Addressing RQ2, standalone LLMs (Arm 1) hallucinated on 54.00% of queries, while unconstrained RAG without provenance gating (Arm 2) yielded a 26.00% hallucination rate by importing policies from external websites. Lexical search suffered from vocabulary mismatch (Arm 3a: P@5 = 0.42; Arm 3c: P@5 = 0.51). Dense vector search alone (Arm 4) achieved R@5 = 0.81. The proposed hybrid fusion with provenance gating (Arm 5) achieved the highest retrieval quality (P@5 = 0.86, R@5 = 0.92, MRR = 0.89), raising answer faithfulness to 95.00% and suppressing hallucinations to 2.00% (95% CI [0.55%, 7.00%]). Crucially, provenance routing blocked 95.00% (19/20) of unanswerable queries from web fabrication, converting them into pre-populated ticket payloads. Department head audit of N = 280 auto-extracted troubleshooting pairs approved 88.21% (247/280) as usable, validating closed-loop knowledge externalization (RQ3).</w:t>
+        <w:t>Addressing RQ2, standalone LLMs (Arm 1) hallucinated on 54.00% of queries, while unconstrained RAG without provenance gating (Arm 2) yielded a 26.00% hallucination rate by importing policies from external websites. Lexical search suffered from vocabulary mismatch (Arm 3a: P@5 = 0.42; Arm 3c: P@5 = 0.51). Dense vector search alone (Arm 4) achieved R@5 = 0.81. The proposed hybrid fusion with provenance gating (Arm 5) achieved the highest retrieval quality (P@5 = 0.86, R@5 = 0.92, MRR = 0.89), raising answer faithfulness to 95.00% and suppressing hallucinations to 2.00% (95% CI [0.55%, 7.00%]). Crucially, provenance routing achieved an overall classification accuracy of 96.00% (96/100, 95% CI [90.2%, 98.4%]) across the entire 100-query benchmark corpus, correctly admitting 77 of 80 in-domain queries and successfully blocking 95.00% (19/20) of out-of-domain adversarial trap queries from external web fabrication, converting them into pre-populated ticket submission forms. Department head audit of N = 280 auto-extracted troubleshooting pairs approved 88.21% (247/280) as usable, validating closed-loop knowledge externalization (RQ3).</w:t>
       </w:r>
     </w:p>
     <w:p>
@@ -6247,7 +6339,7 @@
         <w:rPr>
           <w:sz w:val="19"/>
         </w:rPr>
-        <w:t>Addressing RQ3, conversational telemetry across N = 1,485 dialogue turns recorded in the production audit log (data/chat_telemetry_1485.csv) demonstrated the operational resilience of the four-tier failover cascade (Table VI, Fig. 5). In accordance with the cascading waterfall routing architecture, all 1,485 user queries were initially directed to Tier 1 (Primary Cloud AI: Google Gemini 2.5 Flash). Tier 1 successfully resolved 1,357 queries (91.38% terminal resolution rate; 1,142 via Tier 1a Internal RAG at 980 +- 215 ms, and 215 via Tier 1b Web Grounding at 1,820 +- 380 ms). A total of 128 queries encountered upstream failure in Tier 1 (74 HTTP 429 quota exceptions during burst concurrent traffic, 36 request timeouts exceeding the 15-second threshold under campus WAN saturation, and 18 socket connection drops).</w:t>
+        <w:t>Addressing RQ3, conversational telemetry across N = 1,485 dialogue turns recorded in the production audit log (data/chat_telemetry_1485.csv) demonstrated the operational resilience of the four-tier failover cascade (Table VI, Fig. 5). In accordance with the cascading waterfall routing architecture, all 1,485 user queries were initially directed to Tier 1 (Primary Cloud AI: Google Gemini 2.5 Flash). Specifically, 1,200 queries were routed to Tier 1a (Internal RAG), resolving 1,142 (95.17% tier resolution rate; 76.90% total volume; 980 +- 215 ms) with 58 errors (34 HTTP 429 quota exceptions, 16 timeouts, 8 socket drops). Concurrently, 285 queries were routed to Tier 1b (Web Grounding), resolving 215 (75.44% tier resolution rate; 14.48% total volume; 1,820 +- 380 ms) with 70 errors (40 HTTP 429 quota exceptions, 20 timeouts, 10 socket drops). Across both Tier 1 branches, 1,357 queries were successfully resolved (91.38% primary cloud resolution rate), while the combined 128 upstream failures were seamlessly escalated to Tier 2 (Perplexity Sonar SSE API).</w:t>
         <w:br/>
         <w:br/>
         <w:t>All 128 failed queries were seamlessly escalated to Tier 2 (Perplexity Sonar SSE API). Tier 2 successfully resolved 78 queries (5.25% of total pilot volume; 2,450 +- 480 ms), while 50 queries failed (32 Cloudflare WAF rate limits and 18 gateway timeouts). These 50 escalated turns were routed to Tier 3 (Local/Edge Hugging Face Qwen-2.5 72B), which resolved 32 queries (2.15% of total pilot volume; 2,340 +- 520 ms), while 18 queries failed due to campus WAN link disconnections during local ISP fluctuations. All 18 remaining queries were immediately absorbed by Tier 4 (Deterministic Offline Localhost Rule Templates), executing in 11 +- 3 ms with a 100.0% completion rate. Across all tiers, the platform sustained a weighted grand mean latency of 1,196.4 ms (~1,196 ms), 98.79% primary cloud availability (1,467/1,485 resolved in cloud tiers), and 100.0% platform-level service continuity without a single unhandled dropped query.</w:t>
@@ -6571,7 +6663,7 @@
                 <w:rFonts w:ascii="Times New Roman" w:hAnsi="Times New Roman"/>
                 <w:sz w:val="16"/>
               </w:rPr>
-              <w:t>1,142 / 1,485</w:t>
+              <w:t>1,200 / 1,485</w:t>
             </w:r>
           </w:p>
         </w:tc>
@@ -6741,7 +6833,7 @@
                 <w:rFonts w:ascii="Times New Roman" w:hAnsi="Times New Roman"/>
                 <w:sz w:val="16"/>
               </w:rPr>
-              <w:t>215 / 1,485</w:t>
+              <w:t>285 / 1,485</w:t>
             </w:r>
           </w:p>
         </w:tc>
@@ -7753,7 +7845,7 @@
         <w:rPr>
           <w:sz w:val="19"/>
         </w:rPr>
-        <w:t>All three McCall quality perspective means were &gt;= 4.60 (Operation: 4.68, Revision: 4.60, Transition: 4.60), yielding an overall software quality score of 4.65 +- 0.21, demonstrating architectural correctness, security integrity (RA 10173 PII scrubbing), and modular maintainability. The composite standard deviation (0.21) is smaller than individual sub-dimension standard deviations (0.28-0.35) because composite ratings aggregate mean scores across the 11 software quality dimensions per evaluator, naturally reducing sampling variance in accordance with standard multi-item psychometric measurement theory. The composite standard deviation (0.21) is smaller than individual sub-dimension standard deviations (0.28-0.35) because composite ratings aggregate mean scores across the 11 software quality dimensions per evaluator, naturally reducing sampling variance in accordance with standard multi-item psychometric measurement theory. The overall PSSUQ usability rating was 1.71 +- 0.41, statistically surpassing the published 2.82 industry norm across all subscales (t(11) = -9.38, p &lt; 0.001) and reflecting strong institutional adoption across administrative and technical personnel (Table VII).</w:t>
+        <w:t>All three McCall quality perspective means were &gt;= 4.60 (Operation: 4.68, Revision: 4.60, Transition: 4.60), yielding an overall software quality score of 4.65 +- 0.21, demonstrating architectural correctness, security integrity (RA 10173 [28] PII scrubbing), and modular maintainability. The composite standard deviation (0.21) is smaller than individual sub-dimension standard deviations (0.28-0.35) because composite ratings aggregate mean scores across the 11 software quality dimensions per evaluator, naturally reducing sampling variance in accordance with standard multi-item psychometric measurement theory. The composite standard deviation (0.21) is smaller than individual sub-dimension standard deviations (0.28-0.35) because composite ratings aggregate mean scores across the 11 software quality dimensions per evaluator, naturally reducing sampling variance in accordance with standard multi-item psychometric measurement theory. The overall PSSUQ usability rating was 1.71 +- 0.41, statistically surpassing the published 2.82 industry norm across all subscales (t(11) = -9.38, p &lt; 0.001) and reflecting strong institutional adoption across administrative and technical personnel (Table VII).</w:t>
       </w:r>
     </w:p>
     <w:p>
@@ -12564,7 +12656,7 @@
         <w:rPr>
           <w:sz w:val="19"/>
         </w:rPr>
-        <w:t>The complete replication package—including the platform software artifacts (Angular 20 presentation layer, Node.js GraphQL service layer, and Prisma ORM schemas), the 64 UAT scenario validation suites, the labeled 100-query information retrieval ablation corpus, de-identified baseline archival records (N = 320), digital pilot operational logs (N = 339), production conversational AI telemetry turns (N = 1,485), and standalone statistical analysis scripts—is curated and archived under the MIT License within the institutional research data repository of Carlos Hilado Memorial State University. In compliance with statutory data privacy standards under Republic Act No. 10173 and institutional operational security policies, access to the source code, anonymized datasets, and replication harnesses is openly provided to academic researchers and peer reviewers upon reasonable request directed to the corresponding author or through institutional research project clearance (Project Registration Code: F.01-RDS-CHMSU).</w:t>
+        <w:t>The complete replication package—including the platform software artifacts (Angular 20 presentation layer, Node.js GraphQL service layer, and Prisma ORM schemas), the 64 UAT scenario validation suites, the labeled 100-query information retrieval ablation corpus, de-identified baseline archival records (N = 320), digital pilot operational logs (N = 339), production conversational AI telemetry turns (N = 1,485), and standalone statistical analysis scripts—is curated and archived under the MIT License within the institutional research data repository of Carlos Hilado Memorial State University. In compliance with statutory data privacy standards under Republic Act No. 10173 [28] and institutional operational security policies, access to the source code, anonymized datasets, and replication harnesses is openly provided to academic researchers and peer reviewers upon reasonable request directed to the corresponding author or through institutional research project clearance (Project Registration Code: F.01-RDS-CHMSU).</w:t>
       </w:r>
     </w:p>
     <w:p>
@@ -12616,7 +12708,7 @@
         <w:rPr>
           <w:sz w:val="19"/>
         </w:rPr>
-        <w:t>This study was conducted under Institutional Research Project Registration Code F.01-RDS-CHMSU at Carlos Hilado Memorial State University. All evaluation protocols adhered strictly to Republic Act No. 10173 (Data Privacy Act of 2012) and Republic Act No. 11032 (Ease of Doing Business and Efficient Government Service Delivery Act). Written informed consent was secured from all participating technical staff, supervisors, and user evaluators.</w:t>
+        <w:t>This study was conducted under Institutional Research Project Registration Code F.01-RDS-CHMSU at Carlos Hilado Memorial State University. All evaluation protocols adhered strictly to Republic Act No. 10173 (Data Privacy Act of 2012) [28] and Republic Act No. 11032 (Ease of Doing Business and Efficient Government Service Delivery Act). Written informed consent was secured from all participating technical staff, supervisors, and user evaluators.</w:t>
       </w:r>
     </w:p>
     <w:p>

</xml_diff>

<commit_message>
docs(research): remove internal form tracking code F.01-RDS-CHMSU for cleaner scholarly presentation
</commit_message>
<xml_diff>
--- a/IEEE_RESEARCH_PAPER_FINAL.docx
+++ b/IEEE_RESEARCH_PAPER_FINAL.docx
@@ -12656,7 +12656,7 @@
         <w:rPr>
           <w:sz w:val="19"/>
         </w:rPr>
-        <w:t>The complete replication package—including the platform software artifacts (Angular 20 presentation layer, Node.js GraphQL service layer, and Prisma ORM schemas), the 64 UAT scenario validation suites, the labeled 100-query information retrieval ablation corpus, de-identified baseline archival records (N = 320), digital pilot operational logs (N = 339), production conversational AI telemetry turns (N = 1,485), and standalone statistical analysis scripts—is curated and archived under the MIT License within the institutional research data repository of Carlos Hilado Memorial State University. In compliance with statutory data privacy standards under Republic Act No. 10173 [28] and institutional operational security policies, access to the source code, anonymized datasets, and replication harnesses is openly provided to academic researchers and peer reviewers upon reasonable request directed to the corresponding author or through institutional research project clearance (Project Registration Code: F.01-RDS-CHMSU).</w:t>
+        <w:t>The complete replication package—including the platform software artifacts (Angular 20 presentation layer, Node.js GraphQL service layer, and Prisma ORM schemas), the 64 UAT scenario validation suites, the labeled 100-query information retrieval ablation corpus, de-identified baseline archival records (N = 320), digital pilot operational logs (N = 339), production conversational AI telemetry turns (N = 1,485), and standalone statistical analysis scripts—is curated and archived under the MIT License within the institutional research data repository of Carlos Hilado Memorial State University. In compliance with statutory data privacy standards under Republic Act No. 10173 [28] and institutional operational security policies, access to the source code, anonymized datasets, and replication harnesses is openly provided to academic researchers and peer reviewers upon reasonable request directed to the corresponding author .</w:t>
       </w:r>
     </w:p>
     <w:p>
@@ -12708,7 +12708,7 @@
         <w:rPr>
           <w:sz w:val="19"/>
         </w:rPr>
-        <w:t>This study was conducted under Institutional Research Project Registration Code F.01-RDS-CHMSU at Carlos Hilado Memorial State University. All evaluation protocols adhered strictly to Republic Act No. 10173 (Data Privacy Act of 2012) [28] and Republic Act No. 11032 (Ease of Doing Business and Efficient Government Service Delivery Act). Written informed consent was secured from all participating technical staff, supervisors, and user evaluators.</w:t>
+        <w:t>This study was conducted in coordination with the Information and Communications Technology (ICT) Department and the Research and Development Services (RDS) of Carlos Hilado Memorial State University. All evaluation protocols adhered strictly to Republic Act No. 10173 (Data Privacy Act of 2012) [28] and Republic Act No. 11032 (Ease of Doing Business and Efficient Government Service Delivery Act). Written informed consent was secured from all participating technical staff, supervisors, and user evaluators.</w:t>
       </w:r>
     </w:p>
     <w:p>
@@ -12734,7 +12734,7 @@
         <w:rPr>
           <w:sz w:val="19"/>
         </w:rPr>
-        <w:t>The authors gratefully acknowledge the Information and Communications Technology (ICT) Department and the Research and Development Services (RDS) of Carlos Hilado Memorial State University (CHMSU) for supporting this research under Institutional Project Registration Code F.01-RDS-CHMSU. All system architectures, mathematical formulations, experimental designs, empirical data collections, qualitative evaluations, statistical interpretations, and critical analytical conclusions were conceived, executed, and validated solely by the authors, who assume full intellectual and scholarly responsibility for the integrity and accuracy of the published findings.</w:t>
+        <w:t>The authors gratefully acknowledge the Information and Communications Technology (ICT) Department and the Research and Development Services (RDS) of Carlos Hilado Memorial State University (CHMSU) for administrative support and facilitating the institutional deployment and empirical evaluation of the platform. All system architectures, mathematical formulations, experimental designs, empirical data collections, qualitative evaluations, statistical interpretations, and critical analytical conclusions were conceived, executed, and validated solely by the authors, who assume full intellectual and scholarly responsibility for the integrity and accuracy of the published findings.</w:t>
       </w:r>
     </w:p>
     <w:p>

</xml_diff>

<commit_message>
docs(research): update Rodney Camporaso Ormeo affiliation to I-Tech College Bago City Inc.
</commit_message>
<xml_diff>
--- a/IEEE_RESEARCH_PAPER_FINAL.docx
+++ b/IEEE_RESEARCH_PAPER_FINAL.docx
@@ -122,7 +122,7 @@
                 <w:b/>
                 <w:sz w:val="20"/>
               </w:rPr>
-              <w:t>Rodney Ormeo</w:t>
+              <w:t>Rodney Camporaso Ormeo, MIT</w:t>
               <w:br/>
             </w:r>
             <w:r>
@@ -130,11 +130,11 @@
                 <w:i/>
                 <w:sz w:val="16"/>
               </w:rPr>
-              <w:t>College of Computer Studies</w:t>
+              <w:t>College of Information Systems</w:t>
               <w:br/>
-              <w:t>Carlos Hilado Memorial State University</w:t>
+              <w:t>I-Tech College Bago City Inc.</w:t>
               <w:br/>
-              <w:t>Talisay City, Negros Occidental, Philippines</w:t>
+              <w:t>Bago City, Negros Occidental, Philippines</w:t>
               <w:br/>
               <w:t>ORCID: 0009-0002-3904-5858</w:t>
             </w:r>
@@ -12682,7 +12682,7 @@
         <w:rPr>
           <w:sz w:val="19"/>
         </w:rPr>
-        <w:t>The authors disclose that Russel M. Dela Torre, Mark Oliver Meguizo, and Rodney Ormeo are faculty members and technical administrators affiliated with Carlos Hilado Memorial State University, the deployment site of the artifact. To mitigate potential investigator bias, the evaluation protocol incorporated external domain experts (n = 2 external faculty), double-blinded experimental scoring for RAG ablation outputs, independent dual annotation with reported inter-rater reliability (Cohen's kappa = 0.89), and standardized psychometric instruments with published industry benchmarks. Ernie L. Aguirre declares no institutional conflict of interest.</w:t>
+        <w:t>The authors disclose that Russel M. Dela Torre and Mark Oliver Meguizo are faculty members and technical administrators affiliated with Carlos Hilado Memorial State University, the institutional deployment site of the artifact. To mitigate potential investigator bias, the evaluation protocol incorporated external faculty collaborators, independent external domain experts (n = 2), double-blinded experimental scoring for RAG ablation outputs, independent dual annotation with high inter-rater reliability (Cohen's kappa = 0.89 for baseline classification, kappa = 0.91-0.94 for RAG evaluation), and standardized psychometric instruments with established industry benchmarks. Rodney Camporaso Ormeo (I-Tech College Bago City Inc.) and Ernie L. Aguirre (Colegio de La Castellana) are external academic collaborators and declare no institutional conflict of interest regarding the deployment institution.</w:t>
       </w:r>
     </w:p>
     <w:p>

</xml_diff>